<commit_message>
docs: align test plan with SRS Appendix C and add deviations log
</commit_message>
<xml_diff>
--- a/docs/test-plan/Burndown_Chart_Test_Plan.docx
+++ b/docs/test-plan/Burndown_Chart_Test_Plan.docx
@@ -14482,7 +14482,7 @@
                 <w:sz w:val="16"/>
                 <w:szCs w:val="16"/>
               </w:rPr>
-              <w:t>"</w:t>
+              <w:t>", then 61</w:t>
             </w:r>
           </w:p>
         </w:tc>
@@ -14509,7 +14509,7 @@
                 <w:sz w:val="16"/>
                 <w:szCs w:val="16"/>
               </w:rPr>
-              <w:t>Error message shown; previous valid configuration retained</w:t>
+              <w:t>Error message shown; previous valid configuration retained (maximum sprint length is 60 working days)</w:t>
             </w:r>
           </w:p>
         </w:tc>
@@ -15331,7 +15331,7 @@
                 <w:sz w:val="16"/>
                 <w:szCs w:val="16"/>
               </w:rPr>
-              <w:t>Current Day = 0, 11, -1, "</w:t>
+              <w:t>Current Day = -1, 11, 2.5, "</w:t>
             </w:r>
             <w:proofErr w:type="spellStart"/>
             <w:r>
@@ -15347,7 +15347,7 @@
                 <w:sz w:val="16"/>
                 <w:szCs w:val="16"/>
               </w:rPr>
-              <w:t>" (Duration = 10)</w:t>
+              <w:t>" (Duration = 10); Current Day = 0 and 10 are valid</w:t>
             </w:r>
           </w:p>
         </w:tc>
@@ -15373,7 +15373,7 @@
                 <w:sz w:val="16"/>
                 <w:szCs w:val="16"/>
               </w:rPr>
-              <w:t>Each value rejected; Current Day unchanged</w:t>
+              <w:t>Invalid values rejected and Current Day unchanged; 0 and 10 accepted</w:t>
             </w:r>
           </w:p>
         </w:tc>
@@ -21365,7 +21365,7 @@
                 <w:sz w:val="16"/>
                 <w:szCs w:val="16"/>
               </w:rPr>
-              <w:t>", Infinity; Duration = -1, 0; Current Day = 0, 11; Completion Day out of range</w:t>
+              <w:t>", Infinity; Duration = -1, 0; Current Day = -1, 11; Completion Day out of range</w:t>
             </w:r>
           </w:p>
         </w:tc>
@@ -21543,7 +21543,7 @@
                 <w:sz w:val="16"/>
                 <w:szCs w:val="16"/>
               </w:rPr>
-              <w:t>Set stored value to invalid JSON, then to valid JSON with wrong structure; reload</w:t>
+              <w:t>Set stored value to invalid JSON, then to valid JSON with wrong structure; reload (verified at data layer with restoreFromJSON / parseStoredState; the full page reload applies only if localStorage persistence is enabled)</w:t>
             </w:r>
           </w:p>
         </w:tc>

</xml_diff>